<commit_message>
render informacao to docx - almost perfect
</commit_message>
<xml_diff>
--- a/code/templates/TML_Informacao_template.docx
+++ b/code/templates/TML_Informacao_template.docx
@@ -7,10 +7,7 @@
         <w:pStyle w:val="Ttulo"/>
       </w:pPr>
       <w:r>
-        <w:t>Informação</w:t>
-      </w:r>
-      <w:r>
-        <w:t xml:space="preserve"> n.º TML-XXXX-XXXX-INF-XXXX-DEP</w:t>
+        <w:t>Informação n.º TML-XXXX-XXXX-INF-XXXX-DEP</w:t>
       </w:r>
     </w:p>
     <w:p>
@@ -66,21 +63,7 @@
         <w:rPr>
           <w:lang w:val="en-GB"/>
         </w:rPr>
-        <w:t xml:space="preserve"> </w:t>
-      </w:r>
-      <w:proofErr w:type="gramStart"/>
-      <w:r>
-        <w:rPr>
-          <w:lang w:val="en-GB"/>
-        </w:rPr>
-        <w:t>sit</w:t>
-      </w:r>
-      <w:proofErr w:type="gramEnd"/>
-      <w:r>
-        <w:rPr>
-          <w:lang w:val="en-GB"/>
-        </w:rPr>
-        <w:t xml:space="preserve"> </w:t>
+        <w:t xml:space="preserve"> sit </w:t>
       </w:r>
       <w:proofErr w:type="spellStart"/>
       <w:r>
@@ -1732,21 +1715,7 @@
         <w:rPr>
           <w:lang w:val="en-GB"/>
         </w:rPr>
-        <w:t xml:space="preserve"> </w:t>
-      </w:r>
-      <w:proofErr w:type="gramStart"/>
-      <w:r>
-        <w:rPr>
-          <w:lang w:val="en-GB"/>
-        </w:rPr>
-        <w:t>sit</w:t>
-      </w:r>
-      <w:proofErr w:type="gramEnd"/>
-      <w:r>
-        <w:rPr>
-          <w:lang w:val="en-GB"/>
-        </w:rPr>
-        <w:t xml:space="preserve"> </w:t>
+        <w:t xml:space="preserve"> sit </w:t>
       </w:r>
       <w:proofErr w:type="spellStart"/>
       <w:r>
@@ -2141,7 +2110,6 @@
         <w:t xml:space="preserve"> </w:t>
       </w:r>
       <w:proofErr w:type="spellStart"/>
-      <w:proofErr w:type="gramStart"/>
       <w:r>
         <w:t>himenaeos.</w:t>
       </w:r>
@@ -2149,7 +2117,6 @@
         <w:t>Nas</w:t>
       </w:r>
       <w:proofErr w:type="spellEnd"/>
-      <w:proofErr w:type="gramEnd"/>
       <w:r>
         <w:t xml:space="preserve"> transações de venda: o carregamento de um cartão virtual pressupõe o carregamento</w:t>
       </w:r>
@@ -2196,19 +2163,11 @@
       </w:r>
       <w:proofErr w:type="spellStart"/>
       <w:r>
-        <w:t>ticket_</w:t>
-      </w:r>
-      <w:proofErr w:type="gramStart"/>
-      <w:r>
-        <w:t>code</w:t>
-      </w:r>
-      <w:proofErr w:type="spellEnd"/>
-      <w:r>
-        <w:t xml:space="preserve">  900</w:t>
-      </w:r>
-      <w:proofErr w:type="gramEnd"/>
-      <w:r>
-        <w:t>)</w:t>
+        <w:t>ticket_code</w:t>
+      </w:r>
+      <w:proofErr w:type="spellEnd"/>
+      <w:r>
+        <w:t xml:space="preserve">  900)</w:t>
       </w:r>
       <w:r>
         <w:t xml:space="preserve"> </w:t>
@@ -2248,21 +2207,7 @@
         <w:rPr>
           <w:lang w:val="en-GB"/>
         </w:rPr>
-        <w:t xml:space="preserve"> </w:t>
-      </w:r>
-      <w:proofErr w:type="gramStart"/>
-      <w:r>
-        <w:rPr>
-          <w:lang w:val="en-GB"/>
-        </w:rPr>
-        <w:t>sit</w:t>
-      </w:r>
-      <w:proofErr w:type="gramEnd"/>
-      <w:r>
-        <w:rPr>
-          <w:lang w:val="en-GB"/>
-        </w:rPr>
-        <w:t xml:space="preserve"> </w:t>
+        <w:t xml:space="preserve"> sit </w:t>
       </w:r>
       <w:proofErr w:type="spellStart"/>
       <w:r>
@@ -3383,66 +3328,44 @@
       <w:r>
         <w:t xml:space="preserve">. </w:t>
       </w:r>
-      <w:r>
-        <w:rPr>
-          <w:lang w:val="en-GB"/>
-        </w:rPr>
-        <w:t xml:space="preserve">Duis nec </w:t>
-      </w:r>
-      <w:proofErr w:type="spellStart"/>
-      <w:r>
-        <w:rPr>
-          <w:lang w:val="en-GB"/>
-        </w:rPr>
-        <w:t>purus</w:t>
-      </w:r>
-      <w:proofErr w:type="spellEnd"/>
-      <w:r>
-        <w:rPr>
-          <w:lang w:val="en-GB"/>
-        </w:rPr>
-        <w:t xml:space="preserve"> </w:t>
-      </w:r>
-      <w:proofErr w:type="spellStart"/>
-      <w:r>
-        <w:rPr>
-          <w:lang w:val="en-GB"/>
-        </w:rPr>
+      <w:proofErr w:type="spellStart"/>
+      <w:r>
+        <w:t>Duis</w:t>
+      </w:r>
+      <w:proofErr w:type="spellEnd"/>
+      <w:r>
+        <w:t xml:space="preserve"> </w:t>
+      </w:r>
+      <w:proofErr w:type="spellStart"/>
+      <w:r>
+        <w:t>nec</w:t>
+      </w:r>
+      <w:proofErr w:type="spellEnd"/>
+      <w:r>
+        <w:t xml:space="preserve"> purus </w:t>
+      </w:r>
+      <w:proofErr w:type="spellStart"/>
+      <w:r>
         <w:t>sed</w:t>
       </w:r>
       <w:proofErr w:type="spellEnd"/>
       <w:r>
-        <w:rPr>
-          <w:lang w:val="en-GB"/>
-        </w:rPr>
-        <w:t xml:space="preserve"> </w:t>
-      </w:r>
-      <w:proofErr w:type="spellStart"/>
-      <w:r>
-        <w:rPr>
-          <w:lang w:val="en-GB"/>
-        </w:rPr>
+        <w:t xml:space="preserve"> </w:t>
+      </w:r>
+      <w:proofErr w:type="spellStart"/>
+      <w:r>
         <w:t>nisl</w:t>
       </w:r>
       <w:proofErr w:type="spellEnd"/>
       <w:r>
-        <w:rPr>
-          <w:lang w:val="en-GB"/>
-        </w:rPr>
         <w:t xml:space="preserve"> pulvinar </w:t>
       </w:r>
       <w:proofErr w:type="spellStart"/>
       <w:r>
-        <w:rPr>
-          <w:lang w:val="en-GB"/>
-        </w:rPr>
         <w:t>laoreet</w:t>
       </w:r>
       <w:proofErr w:type="spellEnd"/>
       <w:r>
-        <w:rPr>
-          <w:lang w:val="en-GB"/>
-        </w:rPr>
         <w:t xml:space="preserve"> non quis est. </w:t>
       </w:r>
       <w:proofErr w:type="spellStart"/>
@@ -4088,15 +4011,7 @@
       </w:pPr>
       <w:r>
         <w:lastRenderedPageBreak/>
-        <w:t xml:space="preserve">Exemplo </w:t>
-      </w:r>
-      <w:proofErr w:type="gramStart"/>
-      <w:r>
-        <w:t>titulo</w:t>
-      </w:r>
-      <w:proofErr w:type="gramEnd"/>
-      <w:r>
-        <w:t xml:space="preserve"> 3</w:t>
+        <w:t>Exemplo titulo 3</w:t>
       </w:r>
     </w:p>
     <w:p>
@@ -4703,21 +4618,7 @@
         <w:rPr>
           <w:lang w:val="en-GB"/>
         </w:rPr>
-        <w:t xml:space="preserve"> </w:t>
-      </w:r>
-      <w:proofErr w:type="gramStart"/>
-      <w:r>
-        <w:rPr>
-          <w:lang w:val="en-GB"/>
-        </w:rPr>
-        <w:t>a</w:t>
-      </w:r>
-      <w:proofErr w:type="gramEnd"/>
-      <w:r>
-        <w:rPr>
-          <w:lang w:val="en-GB"/>
-        </w:rPr>
-        <w:t xml:space="preserve"> </w:t>
+        <w:t xml:space="preserve"> a </w:t>
       </w:r>
       <w:proofErr w:type="spellStart"/>
       <w:r>
@@ -6152,18 +6053,13 @@
       </w:r>
       <w:proofErr w:type="spellEnd"/>
       <w:r>
-        <w:t xml:space="preserve"> </w:t>
-      </w:r>
-      <w:proofErr w:type="gramStart"/>
-      <w:r>
-        <w:t xml:space="preserve">sem, </w:t>
+        <w:t xml:space="preserve"> sem, </w:t>
       </w:r>
       <w:proofErr w:type="spellStart"/>
       <w:r>
         <w:t>consequat</w:t>
       </w:r>
       <w:proofErr w:type="spellEnd"/>
-      <w:proofErr w:type="gramEnd"/>
       <w:r>
         <w:t xml:space="preserve"> ut </w:t>
       </w:r>
@@ -6297,21 +6193,7 @@
         <w:rPr>
           <w:lang w:val="en-GB"/>
         </w:rPr>
-        <w:t xml:space="preserve"> </w:t>
-      </w:r>
-      <w:proofErr w:type="gramStart"/>
-      <w:r>
-        <w:rPr>
-          <w:lang w:val="en-GB"/>
-        </w:rPr>
-        <w:t>sit</w:t>
-      </w:r>
-      <w:proofErr w:type="gramEnd"/>
-      <w:r>
-        <w:rPr>
-          <w:lang w:val="en-GB"/>
-        </w:rPr>
-        <w:t xml:space="preserve"> </w:t>
+        <w:t xml:space="preserve"> sit </w:t>
       </w:r>
       <w:proofErr w:type="spellStart"/>
       <w:r>
@@ -6930,156 +6812,101 @@
     </w:p>
     <w:p>
       <w:pPr>
-        <w:pStyle w:val="PargrafodaLista"/>
-        <w:rPr>
-          <w:lang w:val="en-GB"/>
-        </w:rPr>
-      </w:pPr>
-      <w:r>
-        <w:rPr>
-          <w:lang w:val="en-GB"/>
-        </w:rPr>
+        <w:pStyle w:val="Listanumerada"/>
+        <w:numPr>
+          <w:ilvl w:val="0"/>
+          <w:numId w:val="11"/>
+        </w:numPr>
+      </w:pPr>
+      <w:r>
         <w:t xml:space="preserve">Sed vitae ligula </w:t>
       </w:r>
       <w:proofErr w:type="spellStart"/>
       <w:r>
-        <w:rPr>
-          <w:lang w:val="en-GB"/>
-        </w:rPr>
         <w:t>tincidunt</w:t>
       </w:r>
       <w:proofErr w:type="spellEnd"/>
       <w:r>
-        <w:rPr>
-          <w:lang w:val="en-GB"/>
-        </w:rPr>
         <w:t xml:space="preserve">, </w:t>
       </w:r>
       <w:proofErr w:type="spellStart"/>
       <w:r>
-        <w:rPr>
-          <w:lang w:val="en-GB"/>
-        </w:rPr>
         <w:t>imperdiet</w:t>
       </w:r>
       <w:proofErr w:type="spellEnd"/>
       <w:r>
-        <w:rPr>
-          <w:lang w:val="en-GB"/>
-        </w:rPr>
-        <w:t xml:space="preserve"> </w:t>
-      </w:r>
-      <w:proofErr w:type="spellStart"/>
-      <w:r>
-        <w:rPr>
-          <w:lang w:val="en-GB"/>
-        </w:rPr>
+        <w:t xml:space="preserve"> </w:t>
+      </w:r>
+      <w:proofErr w:type="spellStart"/>
+      <w:r>
         <w:t>velit</w:t>
       </w:r>
       <w:proofErr w:type="spellEnd"/>
       <w:r>
-        <w:rPr>
-          <w:lang w:val="en-GB"/>
-        </w:rPr>
-        <w:t xml:space="preserve"> </w:t>
-      </w:r>
-      <w:proofErr w:type="spellStart"/>
-      <w:r>
-        <w:rPr>
-          <w:lang w:val="en-GB"/>
-        </w:rPr>
+        <w:t xml:space="preserve"> </w:t>
+      </w:r>
+      <w:proofErr w:type="spellStart"/>
+      <w:r>
         <w:t>volutpat</w:t>
       </w:r>
       <w:proofErr w:type="spellEnd"/>
       <w:r>
-        <w:rPr>
-          <w:lang w:val="en-GB"/>
-        </w:rPr>
         <w:t xml:space="preserve">, </w:t>
       </w:r>
       <w:proofErr w:type="spellStart"/>
       <w:r>
-        <w:rPr>
-          <w:lang w:val="en-GB"/>
-        </w:rPr>
         <w:t>laoreet</w:t>
       </w:r>
       <w:proofErr w:type="spellEnd"/>
       <w:r>
-        <w:rPr>
-          <w:lang w:val="en-GB"/>
-        </w:rPr>
-        <w:t xml:space="preserve"> </w:t>
-      </w:r>
-      <w:proofErr w:type="spellStart"/>
-      <w:r>
-        <w:rPr>
-          <w:lang w:val="en-GB"/>
-        </w:rPr>
+        <w:t xml:space="preserve"> </w:t>
+      </w:r>
+      <w:proofErr w:type="spellStart"/>
+      <w:r>
         <w:t>velit</w:t>
       </w:r>
       <w:proofErr w:type="spellEnd"/>
       <w:r>
-        <w:rPr>
-          <w:lang w:val="en-GB"/>
-        </w:rPr>
         <w:t>.</w:t>
       </w:r>
     </w:p>
     <w:p>
       <w:pPr>
-        <w:pStyle w:val="PargrafodaLista"/>
-        <w:rPr>
-          <w:lang w:val="en-GB"/>
-        </w:rPr>
-      </w:pPr>
-      <w:proofErr w:type="spellStart"/>
-      <w:r>
-        <w:rPr>
-          <w:lang w:val="en-GB"/>
-        </w:rPr>
+        <w:pStyle w:val="Listanumerada"/>
+        <w:numPr>
+          <w:ilvl w:val="0"/>
+          <w:numId w:val="11"/>
+        </w:numPr>
+      </w:pPr>
+      <w:proofErr w:type="spellStart"/>
+      <w:r>
         <w:lastRenderedPageBreak/>
         <w:t>Fusce</w:t>
       </w:r>
       <w:proofErr w:type="spellEnd"/>
       <w:r>
-        <w:rPr>
-          <w:lang w:val="en-GB"/>
-        </w:rPr>
         <w:t xml:space="preserve"> convallis ex at </w:t>
       </w:r>
       <w:proofErr w:type="spellStart"/>
       <w:r>
-        <w:rPr>
-          <w:lang w:val="en-GB"/>
-        </w:rPr>
         <w:t>efficitur</w:t>
       </w:r>
       <w:proofErr w:type="spellEnd"/>
       <w:r>
-        <w:rPr>
-          <w:lang w:val="en-GB"/>
-        </w:rPr>
-        <w:t xml:space="preserve"> </w:t>
-      </w:r>
-      <w:proofErr w:type="spellStart"/>
-      <w:r>
-        <w:rPr>
-          <w:lang w:val="en-GB"/>
-        </w:rPr>
+        <w:t xml:space="preserve"> </w:t>
+      </w:r>
+      <w:proofErr w:type="spellStart"/>
+      <w:r>
         <w:t>hendrerit</w:t>
       </w:r>
       <w:proofErr w:type="spellEnd"/>
       <w:r>
-        <w:rPr>
-          <w:lang w:val="en-GB"/>
-        </w:rPr>
         <w:t>.</w:t>
       </w:r>
     </w:p>
     <w:p>
       <w:pPr>
-        <w:pStyle w:val="PargrafodaLista"/>
+        <w:pStyle w:val="Listanumerada2"/>
       </w:pPr>
       <w:proofErr w:type="spellStart"/>
       <w:r>
@@ -7140,85 +6967,36 @@
     </w:p>
     <w:p>
       <w:pPr>
-        <w:pStyle w:val="PargrafodaLista"/>
-        <w:rPr>
-          <w:lang w:val="en-GB"/>
-        </w:rPr>
-      </w:pPr>
-      <w:proofErr w:type="spellStart"/>
-      <w:r>
-        <w:rPr>
-          <w:lang w:val="en-GB"/>
-        </w:rPr>
+        <w:pStyle w:val="Listanumerada3"/>
+      </w:pPr>
+      <w:proofErr w:type="spellStart"/>
+      <w:r>
         <w:t>Phasellus</w:t>
       </w:r>
       <w:proofErr w:type="spellEnd"/>
       <w:r>
-        <w:rPr>
-          <w:lang w:val="en-GB"/>
-        </w:rPr>
-        <w:t xml:space="preserve"> in </w:t>
-      </w:r>
-      <w:proofErr w:type="spellStart"/>
-      <w:r>
-        <w:rPr>
-          <w:lang w:val="en-GB"/>
-        </w:rPr>
-        <w:t>purus</w:t>
-      </w:r>
-      <w:proofErr w:type="spellEnd"/>
-      <w:r>
-        <w:rPr>
-          <w:lang w:val="en-GB"/>
-        </w:rPr>
-        <w:t xml:space="preserve"> a </w:t>
-      </w:r>
-      <w:proofErr w:type="spellStart"/>
-      <w:r>
-        <w:rPr>
-          <w:lang w:val="en-GB"/>
-        </w:rPr>
-        <w:t>purus</w:t>
-      </w:r>
-      <w:proofErr w:type="spellEnd"/>
-      <w:r>
-        <w:rPr>
-          <w:lang w:val="en-GB"/>
-        </w:rPr>
-        <w:t xml:space="preserve"> </w:t>
-      </w:r>
-      <w:proofErr w:type="spellStart"/>
-      <w:r>
-        <w:rPr>
-          <w:lang w:val="en-GB"/>
-        </w:rPr>
+        <w:t xml:space="preserve"> in purus a purus </w:t>
+      </w:r>
+      <w:proofErr w:type="spellStart"/>
+      <w:r>
         <w:t>euismod</w:t>
       </w:r>
       <w:proofErr w:type="spellEnd"/>
       <w:r>
-        <w:rPr>
-          <w:lang w:val="en-GB"/>
-        </w:rPr>
-        <w:t xml:space="preserve"> </w:t>
-      </w:r>
-      <w:proofErr w:type="spellStart"/>
-      <w:r>
-        <w:rPr>
-          <w:lang w:val="en-GB"/>
-        </w:rPr>
+        <w:t xml:space="preserve"> </w:t>
+      </w:r>
+      <w:proofErr w:type="spellStart"/>
+      <w:r>
         <w:t>posuere</w:t>
       </w:r>
       <w:proofErr w:type="spellEnd"/>
       <w:r>
-        <w:rPr>
-          <w:lang w:val="en-GB"/>
-        </w:rPr>
         <w:t>.</w:t>
       </w:r>
     </w:p>
     <w:p>
       <w:pPr>
-        <w:pStyle w:val="PargrafodaLista"/>
+        <w:pStyle w:val="Listanumerada3"/>
       </w:pPr>
       <w:proofErr w:type="spellStart"/>
       <w:r>
@@ -7230,15 +7008,7 @@
       </w:r>
       <w:proofErr w:type="spellStart"/>
       <w:r>
-        <w:t>ac</w:t>
-      </w:r>
-      <w:proofErr w:type="spellEnd"/>
-      <w:r>
-        <w:t xml:space="preserve"> </w:t>
-      </w:r>
-      <w:proofErr w:type="spellStart"/>
-      <w:r>
-        <w:t>tellus</w:t>
+        <w:t>actellus</w:t>
       </w:r>
       <w:proofErr w:type="spellEnd"/>
       <w:r>
@@ -7287,7 +7057,7 @@
     </w:p>
     <w:p>
       <w:pPr>
-        <w:pStyle w:val="PargrafodaLista"/>
+        <w:pStyle w:val="Listanumerada2"/>
       </w:pPr>
       <w:proofErr w:type="spellStart"/>
       <w:r>
@@ -7570,6 +7340,9 @@
       </w:r>
       <w:proofErr w:type="spellStart"/>
       <w:r>
+        <w:rPr>
+          <w:u w:val="single"/>
+        </w:rPr>
         <w:t>nisi</w:t>
       </w:r>
       <w:proofErr w:type="spellEnd"/>
@@ -7676,21 +7449,7 @@
         <w:rPr>
           <w:lang w:val="en-GB"/>
         </w:rPr>
-        <w:t xml:space="preserve"> dui </w:t>
-      </w:r>
-      <w:proofErr w:type="gramStart"/>
-      <w:r>
-        <w:rPr>
-          <w:lang w:val="en-GB"/>
-        </w:rPr>
-        <w:t>a</w:t>
-      </w:r>
-      <w:proofErr w:type="gramEnd"/>
-      <w:r>
-        <w:rPr>
-          <w:lang w:val="en-GB"/>
-        </w:rPr>
-        <w:t xml:space="preserve"> ipsum </w:t>
+        <w:t xml:space="preserve"> dui a ipsum </w:t>
       </w:r>
       <w:proofErr w:type="spellStart"/>
       <w:r>
@@ -7802,6 +7561,9 @@
       </w:r>
       <w:proofErr w:type="spellStart"/>
       <w:r>
+        <w:rPr>
+          <w:u w:val="single"/>
+        </w:rPr>
         <w:t>nunc</w:t>
       </w:r>
       <w:proofErr w:type="spellEnd"/>
@@ -8368,9 +8130,43 @@
 <file path=word/numbering.xml><?xml version="1.0" encoding="utf-8"?>
 <w:numbering xmlns:wpc="http://schemas.microsoft.com/office/word/2010/wordprocessingCanvas" xmlns:cx="http://schemas.microsoft.com/office/drawing/2014/chartex" xmlns:cx1="http://schemas.microsoft.com/office/drawing/2015/9/8/chartex" xmlns:cx2="http://schemas.microsoft.com/office/drawing/2015/10/21/chartex" xmlns:cx3="http://schemas.microsoft.com/office/drawing/2016/5/9/chartex" xmlns:cx4="http://schemas.microsoft.com/office/drawing/2016/5/10/chartex" xmlns:cx5="http://schemas.microsoft.com/office/drawing/2016/5/11/chartex" xmlns:cx6="http://schemas.microsoft.com/office/drawing/2016/5/12/chartex" xmlns:cx7="http://schemas.microsoft.com/office/drawing/2016/5/13/chartex" xmlns:cx8="http://schemas.microsoft.com/office/drawing/2016/5/14/chartex" xmlns:mc="http://schemas.openxmlformats.org/markup-compatibility/2006" xmlns:aink="http://schemas.microsoft.com/office/drawing/2016/ink" xmlns:am3d="http://schemas.microsoft.com/office/drawing/2017/model3d" xmlns:o="urn:schemas-microsoft-com:office:office" xmlns:oel="http://schemas.microsoft.com/office/2019/extlst" xmlns:r="http://schemas.openxmlformats.org/officeDocument/2006/relationships" xmlns:m="http://schemas.openxmlformats.org/officeDocument/2006/math" xmlns:v="urn:schemas-microsoft-com:vml" xmlns:wp14="http://schemas.microsoft.com/office/word/2010/wordprocessingDrawing" xmlns:wp="http://schemas.openxmlformats.org/drawingml/2006/wordprocessingDrawing" xmlns:w10="urn:schemas-microsoft-com:office:word" xmlns:w="http://schemas.openxmlformats.org/wordprocessingml/2006/main" xmlns:w14="http://schemas.microsoft.com/office/word/2010/wordml" xmlns:w15="http://schemas.microsoft.com/office/word/2012/wordml" xmlns:w16cex="http://schemas.microsoft.com/office/word/2018/wordml/cex" xmlns:w16cid="http://schemas.microsoft.com/office/word/2016/wordml/cid" xmlns:w16="http://schemas.microsoft.com/office/word/2018/wordml" xmlns:w16du="http://schemas.microsoft.com/office/word/2023/wordml/word16du" xmlns:w16sdtdh="http://schemas.microsoft.com/office/word/2020/wordml/sdtdatahash" xmlns:w16sdtfl="http://schemas.microsoft.com/office/word/2024/wordml/sdtformatlock" xmlns:w16se="http://schemas.microsoft.com/office/word/2015/wordml/symex" xmlns:wpg="http://schemas.microsoft.com/office/word/2010/wordprocessingGroup" xmlns:wpi="http://schemas.microsoft.com/office/word/2010/wordprocessingInk" xmlns:wne="http://schemas.microsoft.com/office/word/2006/wordml" xmlns:wps="http://schemas.microsoft.com/office/word/2010/wordprocessingShape" mc:Ignorable="w14 w15 w16se w16cid w16 w16cex w16sdtdh w16sdtfl w16du wp14">
   <w:abstractNum w:abstractNumId="0" w15:restartNumberingAfterBreak="0">
+    <w:nsid w:val="FFFFFF7E"/>
+    <w:multiLevelType w:val="singleLevel"/>
+    <w:tmpl w:val="CA04821E"/>
+    <w:lvl w:ilvl="0">
+      <w:start w:val="1"/>
+      <w:numFmt w:val="decimal"/>
+      <w:lvlText w:val="%1."/>
+      <w:lvlJc w:val="left"/>
+      <w:pPr>
+        <w:tabs>
+          <w:tab w:val="num" w:pos="926"/>
+        </w:tabs>
+        <w:ind w:left="926" w:hanging="360"/>
+      </w:pPr>
+    </w:lvl>
+  </w:abstractNum>
+  <w:abstractNum w:abstractNumId="1" w15:restartNumberingAfterBreak="0">
+    <w:nsid w:val="FFFFFF7F"/>
+    <w:multiLevelType w:val="singleLevel"/>
+    <w:tmpl w:val="08A4C772"/>
+    <w:lvl w:ilvl="0">
+      <w:start w:val="1"/>
+      <w:numFmt w:val="decimal"/>
+      <w:lvlText w:val="%1."/>
+      <w:lvlJc w:val="left"/>
+      <w:pPr>
+        <w:tabs>
+          <w:tab w:val="num" w:pos="643"/>
+        </w:tabs>
+        <w:ind w:left="643" w:hanging="360"/>
+      </w:pPr>
+    </w:lvl>
+  </w:abstractNum>
+  <w:abstractNum w:abstractNumId="2" w15:restartNumberingAfterBreak="0">
     <w:nsid w:val="FFFFFF88"/>
     <w:multiLevelType w:val="singleLevel"/>
-    <w:tmpl w:val="D51623B6"/>
+    <w:tmpl w:val="9C40B550"/>
     <w:lvl w:ilvl="0">
       <w:start w:val="1"/>
       <w:numFmt w:val="decimal"/>
@@ -8385,7 +8181,7 @@
       </w:pPr>
     </w:lvl>
   </w:abstractNum>
-  <w:abstractNum w:abstractNumId="1" w15:restartNumberingAfterBreak="0">
+  <w:abstractNum w:abstractNumId="3" w15:restartNumberingAfterBreak="0">
     <w:nsid w:val="FFFFFF89"/>
     <w:multiLevelType w:val="singleLevel"/>
     <w:tmpl w:val="B9F0AA4E"/>
@@ -8406,7 +8202,181 @@
       </w:rPr>
     </w:lvl>
   </w:abstractNum>
-  <w:abstractNum w:abstractNumId="2" w15:restartNumberingAfterBreak="0">
+  <w:abstractNum w:abstractNumId="4" w15:restartNumberingAfterBreak="0">
+    <w:nsid w:val="09203574"/>
+    <w:multiLevelType w:val="multilevel"/>
+    <w:tmpl w:val="5B1471D8"/>
+    <w:lvl w:ilvl="0">
+      <w:start w:val="1"/>
+      <w:numFmt w:val="decimal"/>
+      <w:lvlText w:val="%1)"/>
+      <w:lvlJc w:val="left"/>
+      <w:pPr>
+        <w:ind w:left="360" w:hanging="360"/>
+      </w:pPr>
+    </w:lvl>
+    <w:lvl w:ilvl="1">
+      <w:start w:val="1"/>
+      <w:numFmt w:val="lowerLetter"/>
+      <w:pStyle w:val="Listanumerada2"/>
+      <w:lvlText w:val="%2)"/>
+      <w:lvlJc w:val="left"/>
+      <w:pPr>
+        <w:ind w:left="720" w:hanging="360"/>
+      </w:pPr>
+    </w:lvl>
+    <w:lvl w:ilvl="2">
+      <w:start w:val="1"/>
+      <w:numFmt w:val="lowerRoman"/>
+      <w:pStyle w:val="Listanumerada3"/>
+      <w:lvlText w:val="%3)"/>
+      <w:lvlJc w:val="left"/>
+      <w:pPr>
+        <w:ind w:left="1080" w:hanging="360"/>
+      </w:pPr>
+    </w:lvl>
+    <w:lvl w:ilvl="3">
+      <w:start w:val="1"/>
+      <w:numFmt w:val="decimal"/>
+      <w:lvlText w:val="(%4)"/>
+      <w:lvlJc w:val="left"/>
+      <w:pPr>
+        <w:ind w:left="1440" w:hanging="360"/>
+      </w:pPr>
+    </w:lvl>
+    <w:lvl w:ilvl="4">
+      <w:start w:val="1"/>
+      <w:numFmt w:val="lowerLetter"/>
+      <w:lvlText w:val="(%5)"/>
+      <w:lvlJc w:val="left"/>
+      <w:pPr>
+        <w:ind w:left="1800" w:hanging="360"/>
+      </w:pPr>
+    </w:lvl>
+    <w:lvl w:ilvl="5">
+      <w:start w:val="1"/>
+      <w:numFmt w:val="lowerRoman"/>
+      <w:lvlText w:val="(%6)"/>
+      <w:lvlJc w:val="left"/>
+      <w:pPr>
+        <w:ind w:left="2160" w:hanging="360"/>
+      </w:pPr>
+    </w:lvl>
+    <w:lvl w:ilvl="6">
+      <w:start w:val="1"/>
+      <w:numFmt w:val="decimal"/>
+      <w:lvlText w:val="%7."/>
+      <w:lvlJc w:val="left"/>
+      <w:pPr>
+        <w:ind w:left="2520" w:hanging="360"/>
+      </w:pPr>
+    </w:lvl>
+    <w:lvl w:ilvl="7">
+      <w:start w:val="1"/>
+      <w:numFmt w:val="lowerLetter"/>
+      <w:lvlText w:val="%8."/>
+      <w:lvlJc w:val="left"/>
+      <w:pPr>
+        <w:ind w:left="2880" w:hanging="360"/>
+      </w:pPr>
+    </w:lvl>
+    <w:lvl w:ilvl="8">
+      <w:start w:val="1"/>
+      <w:numFmt w:val="lowerRoman"/>
+      <w:lvlText w:val="%9."/>
+      <w:lvlJc w:val="left"/>
+      <w:pPr>
+        <w:ind w:left="3240" w:hanging="360"/>
+      </w:pPr>
+    </w:lvl>
+  </w:abstractNum>
+  <w:abstractNum w:abstractNumId="5" w15:restartNumberingAfterBreak="0">
+    <w:nsid w:val="1C2B46A8"/>
+    <w:multiLevelType w:val="multilevel"/>
+    <w:tmpl w:val="0809001D"/>
+    <w:lvl w:ilvl="0">
+      <w:start w:val="1"/>
+      <w:numFmt w:val="decimal"/>
+      <w:lvlText w:val="%1)"/>
+      <w:lvlJc w:val="left"/>
+      <w:pPr>
+        <w:ind w:left="360" w:hanging="360"/>
+      </w:pPr>
+    </w:lvl>
+    <w:lvl w:ilvl="1">
+      <w:start w:val="1"/>
+      <w:numFmt w:val="lowerLetter"/>
+      <w:lvlText w:val="%2)"/>
+      <w:lvlJc w:val="left"/>
+      <w:pPr>
+        <w:ind w:left="720" w:hanging="360"/>
+      </w:pPr>
+    </w:lvl>
+    <w:lvl w:ilvl="2">
+      <w:start w:val="1"/>
+      <w:numFmt w:val="lowerRoman"/>
+      <w:lvlText w:val="%3)"/>
+      <w:lvlJc w:val="left"/>
+      <w:pPr>
+        <w:ind w:left="1080" w:hanging="360"/>
+      </w:pPr>
+    </w:lvl>
+    <w:lvl w:ilvl="3">
+      <w:start w:val="1"/>
+      <w:numFmt w:val="decimal"/>
+      <w:lvlText w:val="(%4)"/>
+      <w:lvlJc w:val="left"/>
+      <w:pPr>
+        <w:ind w:left="1440" w:hanging="360"/>
+      </w:pPr>
+    </w:lvl>
+    <w:lvl w:ilvl="4">
+      <w:start w:val="1"/>
+      <w:numFmt w:val="lowerLetter"/>
+      <w:lvlText w:val="(%5)"/>
+      <w:lvlJc w:val="left"/>
+      <w:pPr>
+        <w:ind w:left="1800" w:hanging="360"/>
+      </w:pPr>
+    </w:lvl>
+    <w:lvl w:ilvl="5">
+      <w:start w:val="1"/>
+      <w:numFmt w:val="lowerRoman"/>
+      <w:lvlText w:val="(%6)"/>
+      <w:lvlJc w:val="left"/>
+      <w:pPr>
+        <w:ind w:left="2160" w:hanging="360"/>
+      </w:pPr>
+    </w:lvl>
+    <w:lvl w:ilvl="6">
+      <w:start w:val="1"/>
+      <w:numFmt w:val="decimal"/>
+      <w:lvlText w:val="%7."/>
+      <w:lvlJc w:val="left"/>
+      <w:pPr>
+        <w:ind w:left="2520" w:hanging="360"/>
+      </w:pPr>
+    </w:lvl>
+    <w:lvl w:ilvl="7">
+      <w:start w:val="1"/>
+      <w:numFmt w:val="lowerLetter"/>
+      <w:lvlText w:val="%8."/>
+      <w:lvlJc w:val="left"/>
+      <w:pPr>
+        <w:ind w:left="2880" w:hanging="360"/>
+      </w:pPr>
+    </w:lvl>
+    <w:lvl w:ilvl="8">
+      <w:start w:val="1"/>
+      <w:numFmt w:val="lowerRoman"/>
+      <w:lvlText w:val="%9."/>
+      <w:lvlJc w:val="left"/>
+      <w:pPr>
+        <w:ind w:left="3240" w:hanging="360"/>
+      </w:pPr>
+    </w:lvl>
+  </w:abstractNum>
+  <w:abstractNum w:abstractNumId="6" w15:restartNumberingAfterBreak="0">
     <w:nsid w:val="28AD358C"/>
     <w:multiLevelType w:val="hybridMultilevel"/>
     <w:tmpl w:val="EF26246A"/>
@@ -8519,7 +8489,7 @@
       </w:rPr>
     </w:lvl>
   </w:abstractNum>
-  <w:abstractNum w:abstractNumId="3" w15:restartNumberingAfterBreak="0">
+  <w:abstractNum w:abstractNumId="7" w15:restartNumberingAfterBreak="0">
     <w:nsid w:val="30741663"/>
     <w:multiLevelType w:val="multilevel"/>
     <w:tmpl w:val="23783B7C"/>
@@ -8668,7 +8638,7 @@
       </w:rPr>
     </w:lvl>
   </w:abstractNum>
-  <w:abstractNum w:abstractNumId="4" w15:restartNumberingAfterBreak="0">
+  <w:abstractNum w:abstractNumId="8" w15:restartNumberingAfterBreak="0">
     <w:nsid w:val="321A5678"/>
     <w:multiLevelType w:val="multilevel"/>
     <w:tmpl w:val="17124C62"/>
@@ -8817,7 +8787,7 @@
       </w:rPr>
     </w:lvl>
   </w:abstractNum>
-  <w:abstractNum w:abstractNumId="5" w15:restartNumberingAfterBreak="0">
+  <w:abstractNum w:abstractNumId="9" w15:restartNumberingAfterBreak="0">
     <w:nsid w:val="32761C37"/>
     <w:multiLevelType w:val="multilevel"/>
     <w:tmpl w:val="8CC26A3A"/>
@@ -8946,7 +8916,7 @@
       </w:rPr>
     </w:lvl>
   </w:abstractNum>
-  <w:abstractNum w:abstractNumId="6" w15:restartNumberingAfterBreak="0">
+  <w:abstractNum w:abstractNumId="10" w15:restartNumberingAfterBreak="0">
     <w:nsid w:val="3AC2578F"/>
     <w:multiLevelType w:val="hybridMultilevel"/>
     <w:tmpl w:val="C1CE8C0A"/>
@@ -9032,7 +9002,93 @@
       </w:pPr>
     </w:lvl>
   </w:abstractNum>
-  <w:abstractNum w:abstractNumId="7" w15:restartNumberingAfterBreak="0">
+  <w:abstractNum w:abstractNumId="11" w15:restartNumberingAfterBreak="0">
+    <w:nsid w:val="509B0CAB"/>
+    <w:multiLevelType w:val="multilevel"/>
+    <w:tmpl w:val="0809001F"/>
+    <w:lvl w:ilvl="0">
+      <w:start w:val="1"/>
+      <w:numFmt w:val="decimal"/>
+      <w:lvlText w:val="%1."/>
+      <w:lvlJc w:val="left"/>
+      <w:pPr>
+        <w:ind w:left="360" w:hanging="360"/>
+      </w:pPr>
+    </w:lvl>
+    <w:lvl w:ilvl="1">
+      <w:start w:val="1"/>
+      <w:numFmt w:val="decimal"/>
+      <w:lvlText w:val="%1.%2."/>
+      <w:lvlJc w:val="left"/>
+      <w:pPr>
+        <w:ind w:left="792" w:hanging="432"/>
+      </w:pPr>
+    </w:lvl>
+    <w:lvl w:ilvl="2">
+      <w:start w:val="1"/>
+      <w:numFmt w:val="decimal"/>
+      <w:lvlText w:val="%1.%2.%3."/>
+      <w:lvlJc w:val="left"/>
+      <w:pPr>
+        <w:ind w:left="1224" w:hanging="504"/>
+      </w:pPr>
+    </w:lvl>
+    <w:lvl w:ilvl="3">
+      <w:start w:val="1"/>
+      <w:numFmt w:val="decimal"/>
+      <w:lvlText w:val="%1.%2.%3.%4."/>
+      <w:lvlJc w:val="left"/>
+      <w:pPr>
+        <w:ind w:left="1728" w:hanging="648"/>
+      </w:pPr>
+    </w:lvl>
+    <w:lvl w:ilvl="4">
+      <w:start w:val="1"/>
+      <w:numFmt w:val="decimal"/>
+      <w:lvlText w:val="%1.%2.%3.%4.%5."/>
+      <w:lvlJc w:val="left"/>
+      <w:pPr>
+        <w:ind w:left="2232" w:hanging="792"/>
+      </w:pPr>
+    </w:lvl>
+    <w:lvl w:ilvl="5">
+      <w:start w:val="1"/>
+      <w:numFmt w:val="decimal"/>
+      <w:lvlText w:val="%1.%2.%3.%4.%5.%6."/>
+      <w:lvlJc w:val="left"/>
+      <w:pPr>
+        <w:ind w:left="2736" w:hanging="936"/>
+      </w:pPr>
+    </w:lvl>
+    <w:lvl w:ilvl="6">
+      <w:start w:val="1"/>
+      <w:numFmt w:val="decimal"/>
+      <w:lvlText w:val="%1.%2.%3.%4.%5.%6.%7."/>
+      <w:lvlJc w:val="left"/>
+      <w:pPr>
+        <w:ind w:left="3240" w:hanging="1080"/>
+      </w:pPr>
+    </w:lvl>
+    <w:lvl w:ilvl="7">
+      <w:start w:val="1"/>
+      <w:numFmt w:val="decimal"/>
+      <w:lvlText w:val="%1.%2.%3.%4.%5.%6.%7.%8."/>
+      <w:lvlJc w:val="left"/>
+      <w:pPr>
+        <w:ind w:left="3744" w:hanging="1224"/>
+      </w:pPr>
+    </w:lvl>
+    <w:lvl w:ilvl="8">
+      <w:start w:val="1"/>
+      <w:numFmt w:val="decimal"/>
+      <w:lvlText w:val="%1.%2.%3.%4.%5.%6.%7.%8.%9."/>
+      <w:lvlJc w:val="left"/>
+      <w:pPr>
+        <w:ind w:left="4320" w:hanging="1440"/>
+      </w:pPr>
+    </w:lvl>
+  </w:abstractNum>
+  <w:abstractNum w:abstractNumId="12" w15:restartNumberingAfterBreak="0">
     <w:nsid w:val="555A299F"/>
     <w:multiLevelType w:val="multilevel"/>
     <w:tmpl w:val="8392EDB4"/>
@@ -9159,7 +9215,7 @@
       </w:rPr>
     </w:lvl>
   </w:abstractNum>
-  <w:abstractNum w:abstractNumId="8" w15:restartNumberingAfterBreak="0">
+  <w:abstractNum w:abstractNumId="13" w15:restartNumberingAfterBreak="0">
     <w:nsid w:val="6E0A516A"/>
     <w:multiLevelType w:val="hybridMultilevel"/>
     <w:tmpl w:val="D638C2E4"/>
@@ -9273,30 +9329,45 @@
     </w:lvl>
   </w:abstractNum>
   <w:num w:numId="1" w16cid:durableId="1279265227">
+    <w:abstractNumId w:val="12"/>
+  </w:num>
+  <w:num w:numId="2" w16cid:durableId="1375815318">
+    <w:abstractNumId w:val="10"/>
+  </w:num>
+  <w:num w:numId="3" w16cid:durableId="1495610325">
+    <w:abstractNumId w:val="6"/>
+  </w:num>
+  <w:num w:numId="4" w16cid:durableId="1380593001">
+    <w:abstractNumId w:val="13"/>
+  </w:num>
+  <w:num w:numId="5" w16cid:durableId="1925414160">
+    <w:abstractNumId w:val="9"/>
+  </w:num>
+  <w:num w:numId="6" w16cid:durableId="876510290">
     <w:abstractNumId w:val="7"/>
   </w:num>
-  <w:num w:numId="2" w16cid:durableId="1375815318">
-    <w:abstractNumId w:val="6"/>
+  <w:num w:numId="7" w16cid:durableId="1638217804">
+    <w:abstractNumId w:val="8"/>
   </w:num>
-  <w:num w:numId="3" w16cid:durableId="1495610325">
+  <w:num w:numId="8" w16cid:durableId="1452631792">
+    <w:abstractNumId w:val="3"/>
+  </w:num>
+  <w:num w:numId="9" w16cid:durableId="69041599">
     <w:abstractNumId w:val="2"/>
   </w:num>
-  <w:num w:numId="4" w16cid:durableId="1380593001">
-    <w:abstractNumId w:val="8"/>
-  </w:num>
-  <w:num w:numId="5" w16cid:durableId="1925414160">
+  <w:num w:numId="10" w16cid:durableId="1118335647">
     <w:abstractNumId w:val="5"/>
   </w:num>
-  <w:num w:numId="6" w16cid:durableId="876510290">
-    <w:abstractNumId w:val="3"/>
+  <w:num w:numId="11" w16cid:durableId="1674526095">
+    <w:abstractNumId w:val="11"/>
   </w:num>
-  <w:num w:numId="7" w16cid:durableId="1638217804">
+  <w:num w:numId="12" w16cid:durableId="1360005006">
     <w:abstractNumId w:val="4"/>
   </w:num>
-  <w:num w:numId="8" w16cid:durableId="1452631792">
+  <w:num w:numId="13" w16cid:durableId="2006010824">
     <w:abstractNumId w:val="1"/>
   </w:num>
-  <w:num w:numId="9" w16cid:durableId="69041599">
+  <w:num w:numId="14" w16cid:durableId="196238814">
     <w:abstractNumId w:val="0"/>
   </w:num>
 </w:numbering>
@@ -9972,13 +10043,17 @@
   <w:style w:type="paragraph" w:styleId="Listanumerada">
     <w:name w:val="List Number"/>
     <w:basedOn w:val="Normal"/>
-    <w:rsid w:val="00D02FD8"/>
+    <w:rsid w:val="00232064"/>
     <w:pPr>
       <w:numPr>
         <w:numId w:val="9"/>
       </w:numPr>
-      <w:contextualSpacing/>
+      <w:spacing w:after="200"/>
+      <w:ind w:left="357" w:right="-6" w:hanging="357"/>
     </w:pPr>
+    <w:rPr>
+      <w:lang w:val="en-GB"/>
+    </w:rPr>
   </w:style>
   <w:style w:type="character" w:customStyle="1" w:styleId="Ttulo4Carter">
     <w:name w:val="Título 4 Caráter"/>
@@ -10024,6 +10099,30 @@
       <w:spacing w:val="-1"/>
       <w:lang w:val="pt-PT" w:eastAsia="en-US"/>
     </w:rPr>
+  </w:style>
+  <w:style w:type="paragraph" w:styleId="Listanumerada2">
+    <w:name w:val="List Number 2"/>
+    <w:basedOn w:val="Listanumerada"/>
+    <w:rsid w:val="00232064"/>
+    <w:pPr>
+      <w:numPr>
+        <w:ilvl w:val="1"/>
+        <w:numId w:val="12"/>
+      </w:numPr>
+    </w:pPr>
+    <w:rPr>
+      <w:lang w:val="pt-PT"/>
+    </w:rPr>
+  </w:style>
+  <w:style w:type="paragraph" w:styleId="Listanumerada3">
+    <w:name w:val="List Number 3"/>
+    <w:basedOn w:val="Listanumerada2"/>
+    <w:rsid w:val="00232064"/>
+    <w:pPr>
+      <w:numPr>
+        <w:ilvl w:val="2"/>
+      </w:numPr>
+    </w:pPr>
   </w:style>
 </w:styles>
 </file>
@@ -10605,7 +10704,12 @@
 </file>
 
 <file path=customXml/item2.xml><?xml version="1.0" encoding="utf-8"?>
-<b:Sources xmlns:b="http://schemas.openxmlformats.org/officeDocument/2006/bibliography" xmlns="http://schemas.openxmlformats.org/officeDocument/2006/bibliography" SelectedStyle="\APASixthEditionOfficeOnline.xsl" StyleName="APA" Version="6"/>
+<?mso-contentType ?>
+<FormTemplates xmlns="http://schemas.microsoft.com/sharepoint/v3/contenttype/forms">
+  <Display>DocumentLibraryForm</Display>
+  <Edit>DocumentLibraryForm</Edit>
+  <New>DocumentLibraryForm</New>
+</FormTemplates>
 </file>
 
 <file path=customXml/item3.xml><?xml version="1.0" encoding="utf-8"?>
@@ -10620,12 +10724,7 @@
 </file>
 
 <file path=customXml/item4.xml><?xml version="1.0" encoding="utf-8"?>
-<?mso-contentType ?>
-<FormTemplates xmlns="http://schemas.microsoft.com/sharepoint/v3/contenttype/forms">
-  <Display>DocumentLibraryForm</Display>
-  <Edit>DocumentLibraryForm</Edit>
-  <New>DocumentLibraryForm</New>
-</FormTemplates>
+<b:Sources xmlns:b="http://schemas.openxmlformats.org/officeDocument/2006/bibliography" xmlns="http://schemas.openxmlformats.org/officeDocument/2006/bibliography" SelectedStyle="\APASixthEditionOfficeOnline.xsl" StyleName="APA" Version="6"/>
 </file>
 
 <file path=customXml/itemProps1.xml><?xml version="1.0" encoding="utf-8"?>
@@ -10648,9 +10747,9 @@
 </file>
 
 <file path=customXml/itemProps2.xml><?xml version="1.0" encoding="utf-8"?>
-<ds:datastoreItem xmlns:ds="http://schemas.openxmlformats.org/officeDocument/2006/customXml" ds:itemID="{49D826E0-2565-41C1-BC58-7F61B324D97B}">
+<ds:datastoreItem xmlns:ds="http://schemas.openxmlformats.org/officeDocument/2006/customXml" ds:itemID="{79835C5B-6CCA-47AF-9D59-6E36089D6B5E}">
   <ds:schemaRefs>
-    <ds:schemaRef ds:uri="http://schemas.openxmlformats.org/officeDocument/2006/bibliography"/>
+    <ds:schemaRef ds:uri="http://schemas.microsoft.com/sharepoint/v3/contenttype/forms"/>
   </ds:schemaRefs>
 </ds:datastoreItem>
 </file>
@@ -10667,9 +10766,9 @@
 </file>
 
 <file path=customXml/itemProps4.xml><?xml version="1.0" encoding="utf-8"?>
-<ds:datastoreItem xmlns:ds="http://schemas.openxmlformats.org/officeDocument/2006/customXml" ds:itemID="{79835C5B-6CCA-47AF-9D59-6E36089D6B5E}">
+<ds:datastoreItem xmlns:ds="http://schemas.openxmlformats.org/officeDocument/2006/customXml" ds:itemID="{49D826E0-2565-41C1-BC58-7F61B324D97B}">
   <ds:schemaRefs>
-    <ds:schemaRef ds:uri="http://schemas.microsoft.com/sharepoint/v3/contenttype/forms"/>
+    <ds:schemaRef ds:uri="http://schemas.openxmlformats.org/officeDocument/2006/bibliography"/>
   </ds:schemaRefs>
 </ds:datastoreItem>
 </file>

</xml_diff>